<commit_message>
Add observation cards to chapter two workbook
</commit_message>
<xml_diff>
--- a/教材/學生練習本/第二章_學生練習本_反派有話要說.docx
+++ b/教材/學生練習本/第二章_學生練習本_反派有話要說.docx
@@ -1633,7 +1633,7 @@
           <w:color w:val="000000"/>
           <w:sz w:val="36"/>
         </w:rPr>
-        <w:t>其他故事選題庫</w:t>
+        <w:t>故事觀察格：挑一則看得更深</w:t>
       </w:r>
     </w:p>
     <w:p>
@@ -1648,805 +1648,494 @@
           <w:color w:val="000000"/>
           <w:sz w:val="21"/>
         </w:rPr>
-        <w:t>灰姑娘是共同練習。最後寫作時，你可以改選下面任一則故事。只需要選一則，不用每一則都寫。</w:t>
+        <w:t>看完投影片再填。不是每格都要完成；最後只選一則，繼續寫成日記。</w:t>
       </w:r>
     </w:p>
     <w:tbl>
       <w:tblPr>
-        <w:tblW w:type="dxa" w:w="9360"/>
+        <w:tblW w:type="dxa" w:w="10376"/>
+        <w:jc w:val="left"/>
         <w:tblLayout w:type="fixed"/>
         <w:tblLook w:firstColumn="1" w:firstRow="1" w:lastColumn="0" w:lastRow="0" w:noHBand="0" w:noVBand="1" w:val="04A0"/>
       </w:tblPr>
       <w:tblGrid>
-        <w:gridCol w:w="2594"/>
-        <w:gridCol w:w="2594"/>
-        <w:gridCol w:w="2594"/>
-        <w:gridCol w:w="2594"/>
+        <w:gridCol w:w="5188"/>
+        <w:gridCol w:w="5188"/>
       </w:tblGrid>
       <w:tr>
-        <w:tc>
-          <w:tcPr>
-            <w:tcW w:type="dxa" w:w="1700"/>
-            <w:shd w:fill="E8E8E8"/>
-            <w:tcBorders>
-              <w:top w:val="single" w:sz="6" w:space="0" w:color="777777"/>
-              <w:left w:val="single" w:sz="6" w:space="0" w:color="777777"/>
-              <w:bottom w:val="single" w:sz="6" w:space="0" w:color="777777"/>
-              <w:right w:val="single" w:sz="6" w:space="0" w:color="777777"/>
-            </w:tcBorders>
-            <w:tcMar>
-              <w:top w:w="90" w:type="dxa"/>
-              <w:start w:w="110" w:type="dxa"/>
-              <w:bottom w:w="90" w:type="dxa"/>
-              <w:end w:w="110" w:type="dxa"/>
-            </w:tcMar>
+        <w:trPr>
+          <w:trHeight w:val="2700" w:hRule="atLeast"/>
+        </w:trPr>
+        <w:tc>
+          <w:tcPr>
+            <w:tcW w:type="dxa" w:w="5188"/>
+            <w:vAlign w:val="top"/>
+            <w:tcMar>
+              <w:top w:w="100" w:type="dxa"/>
+              <w:start w:w="140" w:type="dxa"/>
+              <w:bottom w:w="100" w:type="dxa"/>
+              <w:end w:w="140" w:type="dxa"/>
+            </w:tcMar>
+            <w:tcBorders>
+              <w:top w:val="single" w:sz="10" w:space="0" w:color="B7B7B7"/>
+              <w:left w:val="single" w:sz="10" w:space="0" w:color="B7B7B7"/>
+              <w:bottom w:val="single" w:sz="10" w:space="0" w:color="B7B7B7"/>
+              <w:right w:val="single" w:sz="10" w:space="0" w:color="B7B7B7"/>
+            </w:tcBorders>
           </w:tcPr>
           <w:p>
             <w:pPr>
-              <w:spacing w:before="0" w:after="0" w:line="259" w:lineRule="auto"/>
-              <w:jc w:val="center"/>
+              <w:spacing w:after="80"/>
             </w:pPr>
             <w:r/>
             <w:r>
               <w:rPr>
-                <w:rFonts w:ascii="Arial" w:hAnsi="Arial" w:eastAsia="PingFang TC"/>
+                <w:rFonts w:ascii="Microsoft JhengHei" w:hAnsi="Microsoft JhengHei" w:eastAsia="Microsoft JhengHei"/>
                 <w:b/>
-                <w:color w:val="000000"/>
-                <w:sz w:val="17"/>
+                <w:color w:val="174F3B"/>
+                <w:sz w:val="24"/>
               </w:rPr>
-              <w:t>故事</w:t>
+              <w:t>□ 灰姑娘的後母</w:t>
             </w:r>
           </w:p>
-        </w:tc>
-        <w:tc>
-          <w:tcPr>
-            <w:tcW w:type="dxa" w:w="1700"/>
-            <w:shd w:fill="E8E8E8"/>
-            <w:tcBorders>
-              <w:top w:val="single" w:sz="6" w:space="0" w:color="777777"/>
-              <w:left w:val="single" w:sz="6" w:space="0" w:color="777777"/>
-              <w:bottom w:val="single" w:sz="6" w:space="0" w:color="777777"/>
-              <w:right w:val="single" w:sz="6" w:space="0" w:color="777777"/>
-            </w:tcBorders>
-            <w:tcMar>
-              <w:top w:w="90" w:type="dxa"/>
-              <w:start w:w="110" w:type="dxa"/>
-              <w:bottom w:w="90" w:type="dxa"/>
-              <w:end w:w="110" w:type="dxa"/>
-            </w:tcMar>
-          </w:tcPr>
           <w:p>
             <w:pPr>
-              <w:spacing w:before="0" w:after="0" w:line="259" w:lineRule="auto"/>
-              <w:jc w:val="center"/>
+              <w:spacing w:before="40" w:after="20"/>
             </w:pPr>
-            <w:r/>
             <w:r>
               <w:rPr>
-                <w:rFonts w:ascii="Arial" w:hAnsi="Arial" w:eastAsia="PingFang TC"/>
+                <w:rFonts w:ascii="Microsoft JhengHei" w:hAnsi="Microsoft JhengHei" w:eastAsia="Microsoft JhengHei"/>
                 <w:b/>
-                <w:color w:val="000000"/>
-                <w:sz w:val="17"/>
+                <w:color w:val="A9782A"/>
+                <w:sz w:val="19"/>
               </w:rPr>
-              <w:t>可以替誰寫日記</w:t>
+              <w:t>他／她做了什麼？</w:t>
             </w:r>
           </w:p>
-        </w:tc>
-        <w:tc>
-          <w:tcPr>
-            <w:tcW w:type="dxa" w:w="3000"/>
-            <w:shd w:fill="E8E8E8"/>
-            <w:tcBorders>
-              <w:top w:val="single" w:sz="6" w:space="0" w:color="777777"/>
-              <w:left w:val="single" w:sz="6" w:space="0" w:color="777777"/>
-              <w:bottom w:val="single" w:sz="6" w:space="0" w:color="777777"/>
-              <w:right w:val="single" w:sz="6" w:space="0" w:color="777777"/>
-            </w:tcBorders>
-            <w:tcMar>
-              <w:top w:w="90" w:type="dxa"/>
-              <w:start w:w="110" w:type="dxa"/>
-              <w:bottom w:w="90" w:type="dxa"/>
-              <w:end w:w="110" w:type="dxa"/>
-            </w:tcMar>
-          </w:tcPr>
           <w:p>
             <w:pPr>
-              <w:spacing w:before="0" w:after="0" w:line="259" w:lineRule="auto"/>
-              <w:jc w:val="center"/>
+              <w:spacing w:after="80"/>
             </w:pPr>
-            <w:r/>
             <w:r>
               <w:rPr>
-                <w:rFonts w:ascii="Arial" w:hAnsi="Arial" w:eastAsia="PingFang TC"/>
-                <w:b/>
-                <w:color w:val="000000"/>
-                <w:sz w:val="17"/>
+                <w:rFonts w:ascii="Microsoft JhengHei" w:hAnsi="Microsoft JhengHei" w:eastAsia="Microsoft JhengHei"/>
+                <w:b w:val="0"/>
+                <w:color w:val="202020"/>
+                <w:sz w:val="20"/>
               </w:rPr>
-              <w:t>他做錯了什麼</w:t>
+              <w:t>偏心、欺負灰姑娘，還阻止她去舞會。</w:t>
             </w:r>
           </w:p>
-        </w:tc>
-        <w:tc>
-          <w:tcPr>
-            <w:tcW w:type="dxa" w:w="2960"/>
-            <w:shd w:fill="E8E8E8"/>
-            <w:tcBorders>
-              <w:top w:val="single" w:sz="6" w:space="0" w:color="777777"/>
-              <w:left w:val="single" w:sz="6" w:space="0" w:color="777777"/>
-              <w:bottom w:val="single" w:sz="6" w:space="0" w:color="777777"/>
-              <w:right w:val="single" w:sz="6" w:space="0" w:color="777777"/>
-            </w:tcBorders>
-            <w:tcMar>
-              <w:top w:w="90" w:type="dxa"/>
-              <w:start w:w="110" w:type="dxa"/>
-              <w:bottom w:w="90" w:type="dxa"/>
-              <w:end w:w="110" w:type="dxa"/>
-            </w:tcMar>
-          </w:tcPr>
           <w:p>
             <w:pPr>
-              <w:spacing w:before="0" w:after="0" w:line="259" w:lineRule="auto"/>
-              <w:jc w:val="center"/>
+              <w:spacing w:before="40" w:after="20"/>
             </w:pPr>
-            <w:r/>
             <w:r>
               <w:rPr>
-                <w:rFonts w:ascii="Arial" w:hAnsi="Arial" w:eastAsia="PingFang TC"/>
+                <w:rFonts w:ascii="Microsoft JhengHei" w:hAnsi="Microsoft JhengHei" w:eastAsia="Microsoft JhengHei"/>
                 <w:b/>
-                <w:color w:val="000000"/>
-                <w:sz w:val="17"/>
+                <w:color w:val="A9782A"/>
+                <w:sz w:val="19"/>
               </w:rPr>
-              <w:t>可能沒被看見的地方</w:t>
+              <w:t>我注意到的細節或疑問：</w:t>
             </w:r>
           </w:p>
-        </w:tc>
-      </w:tr>
-      <w:tr>
-        <w:tc>
-          <w:tcPr>
-            <w:tcW w:type="dxa" w:w="1700"/>
-            <w:tcBorders>
-              <w:top w:val="single" w:sz="6" w:space="0" w:color="B8B8B8"/>
-              <w:left w:val="single" w:sz="6" w:space="0" w:color="B8B8B8"/>
-              <w:bottom w:val="single" w:sz="6" w:space="0" w:color="B8B8B8"/>
-              <w:right w:val="single" w:sz="6" w:space="0" w:color="B8B8B8"/>
-            </w:tcBorders>
-            <w:tcMar>
-              <w:top w:w="90" w:type="dxa"/>
-              <w:start w:w="110" w:type="dxa"/>
-              <w:bottom w:w="90" w:type="dxa"/>
-              <w:end w:w="110" w:type="dxa"/>
-            </w:tcMar>
-          </w:tcPr>
           <w:p>
             <w:pPr>
-              <w:spacing w:before="0" w:after="0" w:line="259" w:lineRule="auto"/>
+              <w:spacing w:after="80"/>
             </w:pPr>
-            <w:r/>
             <w:r>
               <w:rPr>
-                <w:rFonts w:ascii="Arial" w:hAnsi="Arial" w:eastAsia="PingFang TC"/>
+                <w:rFonts w:ascii="Microsoft JhengHei" w:hAnsi="Microsoft JhengHei" w:eastAsia="Microsoft JhengHei"/>
                 <w:b w:val="0"/>
-                <w:color w:val="000000"/>
-                <w:sz w:val="17"/>
+                <w:color w:val="202020"/>
+                <w:sz w:val="20"/>
               </w:rPr>
-              <w:t>灰姑娘</w:t>
+              <w:t>＿＿＿＿＿＿＿＿＿＿＿＿＿＿＿＿＿＿＿＿＿＿＿＿</w:t>
             </w:r>
           </w:p>
-        </w:tc>
-        <w:tc>
-          <w:tcPr>
-            <w:tcW w:type="dxa" w:w="1700"/>
-            <w:tcBorders>
-              <w:top w:val="single" w:sz="6" w:space="0" w:color="B8B8B8"/>
-              <w:left w:val="single" w:sz="6" w:space="0" w:color="B8B8B8"/>
-              <w:bottom w:val="single" w:sz="6" w:space="0" w:color="B8B8B8"/>
-              <w:right w:val="single" w:sz="6" w:space="0" w:color="B8B8B8"/>
-            </w:tcBorders>
-            <w:tcMar>
-              <w:top w:w="90" w:type="dxa"/>
-              <w:start w:w="110" w:type="dxa"/>
-              <w:bottom w:w="90" w:type="dxa"/>
-              <w:end w:w="110" w:type="dxa"/>
-            </w:tcMar>
-          </w:tcPr>
           <w:p>
             <w:pPr>
-              <w:spacing w:before="0" w:after="0" w:line="259" w:lineRule="auto"/>
+              <w:spacing w:before="40" w:after="20"/>
             </w:pPr>
-            <w:r/>
             <w:r>
               <w:rPr>
-                <w:rFonts w:ascii="Arial" w:hAnsi="Arial" w:eastAsia="PingFang TC"/>
-                <w:b w:val="0"/>
-                <w:color w:val="000000"/>
-                <w:sz w:val="17"/>
+                <w:rFonts w:ascii="Microsoft JhengHei" w:hAnsi="Microsoft JhengHei" w:eastAsia="Microsoft JhengHei"/>
+                <w:b/>
+                <w:color w:val="A9782A"/>
+                <w:sz w:val="19"/>
               </w:rPr>
-              <w:t>後母</w:t>
+              <w:t>他／她可能害怕或想守護什麼？</w:t>
             </w:r>
           </w:p>
-        </w:tc>
-        <w:tc>
-          <w:tcPr>
-            <w:tcW w:type="dxa" w:w="3000"/>
-            <w:tcBorders>
-              <w:top w:val="single" w:sz="6" w:space="0" w:color="B8B8B8"/>
-              <w:left w:val="single" w:sz="6" w:space="0" w:color="B8B8B8"/>
-              <w:bottom w:val="single" w:sz="6" w:space="0" w:color="B8B8B8"/>
-              <w:right w:val="single" w:sz="6" w:space="0" w:color="B8B8B8"/>
-            </w:tcBorders>
-            <w:tcMar>
-              <w:top w:w="90" w:type="dxa"/>
-              <w:start w:w="110" w:type="dxa"/>
-              <w:bottom w:w="90" w:type="dxa"/>
-              <w:end w:w="110" w:type="dxa"/>
-            </w:tcMar>
-          </w:tcPr>
           <w:p>
             <w:pPr>
-              <w:spacing w:before="0" w:after="0" w:line="259" w:lineRule="auto"/>
+              <w:spacing w:after="80"/>
             </w:pPr>
-            <w:r/>
             <w:r>
               <w:rPr>
-                <w:rFonts w:ascii="Arial" w:hAnsi="Arial" w:eastAsia="PingFang TC"/>
+                <w:rFonts w:ascii="Microsoft JhengHei" w:hAnsi="Microsoft JhengHei" w:eastAsia="Microsoft JhengHei"/>
                 <w:b w:val="0"/>
-                <w:color w:val="000000"/>
-                <w:sz w:val="17"/>
+                <w:color w:val="202020"/>
+                <w:sz w:val="20"/>
               </w:rPr>
-              <w:t>偏心、欺負灰姑娘、阻止她去舞會。</w:t>
+              <w:t>＿＿＿＿＿＿＿＿＿＿＿＿＿＿＿＿＿＿＿＿＿＿＿＿</w:t>
             </w:r>
           </w:p>
         </w:tc>
         <w:tc>
           <w:tcPr>
-            <w:tcW w:type="dxa" w:w="2960"/>
-            <w:tcBorders>
-              <w:top w:val="single" w:sz="6" w:space="0" w:color="B8B8B8"/>
-              <w:left w:val="single" w:sz="6" w:space="0" w:color="B8B8B8"/>
-              <w:bottom w:val="single" w:sz="6" w:space="0" w:color="B8B8B8"/>
-              <w:right w:val="single" w:sz="6" w:space="0" w:color="B8B8B8"/>
-            </w:tcBorders>
-            <w:tcMar>
-              <w:top w:w="90" w:type="dxa"/>
-              <w:start w:w="110" w:type="dxa"/>
-              <w:bottom w:w="90" w:type="dxa"/>
-              <w:end w:w="110" w:type="dxa"/>
-            </w:tcMar>
+            <w:tcW w:type="dxa" w:w="5188"/>
+            <w:vAlign w:val="top"/>
+            <w:tcMar>
+              <w:top w:w="100" w:type="dxa"/>
+              <w:start w:w="140" w:type="dxa"/>
+              <w:bottom w:w="100" w:type="dxa"/>
+              <w:end w:w="140" w:type="dxa"/>
+            </w:tcMar>
+            <w:tcBorders>
+              <w:top w:val="single" w:sz="10" w:space="0" w:color="B7B7B7"/>
+              <w:left w:val="single" w:sz="10" w:space="0" w:color="B7B7B7"/>
+              <w:bottom w:val="single" w:sz="10" w:space="0" w:color="B7B7B7"/>
+              <w:right w:val="single" w:sz="10" w:space="0" w:color="B7B7B7"/>
+            </w:tcBorders>
           </w:tcPr>
           <w:p>
             <w:pPr>
-              <w:spacing w:before="0" w:after="0" w:line="259" w:lineRule="auto"/>
+              <w:spacing w:after="80"/>
             </w:pPr>
             <w:r/>
             <w:r>
               <w:rPr>
-                <w:rFonts w:ascii="Arial" w:hAnsi="Arial" w:eastAsia="PingFang TC"/>
-                <w:b w:val="0"/>
-                <w:color w:val="000000"/>
-                <w:sz w:val="17"/>
+                <w:rFonts w:ascii="Microsoft JhengHei" w:hAnsi="Microsoft JhengHei" w:eastAsia="Microsoft JhengHei"/>
+                <w:b/>
+                <w:color w:val="174F3B"/>
+                <w:sz w:val="24"/>
               </w:rPr>
-              <w:t>她怕女兒沒有未來，也怕自己再次失去依靠。</w:t>
+              <w:t>□ 三隻小豬的大野狼</w:t>
             </w:r>
           </w:p>
-        </w:tc>
-      </w:tr>
-      <w:tr>
-        <w:tc>
-          <w:tcPr>
-            <w:tcW w:type="dxa" w:w="1700"/>
-            <w:tcBorders>
-              <w:top w:val="single" w:sz="6" w:space="0" w:color="B8B8B8"/>
-              <w:left w:val="single" w:sz="6" w:space="0" w:color="B8B8B8"/>
-              <w:bottom w:val="single" w:sz="6" w:space="0" w:color="B8B8B8"/>
-              <w:right w:val="single" w:sz="6" w:space="0" w:color="B8B8B8"/>
-            </w:tcBorders>
-            <w:tcMar>
-              <w:top w:w="90" w:type="dxa"/>
-              <w:start w:w="110" w:type="dxa"/>
-              <w:bottom w:w="90" w:type="dxa"/>
-              <w:end w:w="110" w:type="dxa"/>
-            </w:tcMar>
-          </w:tcPr>
           <w:p>
             <w:pPr>
-              <w:spacing w:before="0" w:after="0" w:line="259" w:lineRule="auto"/>
+              <w:spacing w:before="40" w:after="20"/>
             </w:pPr>
-            <w:r/>
             <w:r>
               <w:rPr>
-                <w:rFonts w:ascii="Arial" w:hAnsi="Arial" w:eastAsia="PingFang TC"/>
-                <w:b w:val="0"/>
-                <w:color w:val="000000"/>
-                <w:sz w:val="17"/>
+                <w:rFonts w:ascii="Microsoft JhengHei" w:hAnsi="Microsoft JhengHei" w:eastAsia="Microsoft JhengHei"/>
+                <w:b/>
+                <w:color w:val="A9782A"/>
+                <w:sz w:val="19"/>
               </w:rPr>
-              <w:t>三隻小豬</w:t>
+              <w:t>他／她做了什麼？</w:t>
             </w:r>
           </w:p>
-        </w:tc>
-        <w:tc>
-          <w:tcPr>
-            <w:tcW w:type="dxa" w:w="1700"/>
-            <w:tcBorders>
-              <w:top w:val="single" w:sz="6" w:space="0" w:color="B8B8B8"/>
-              <w:left w:val="single" w:sz="6" w:space="0" w:color="B8B8B8"/>
-              <w:bottom w:val="single" w:sz="6" w:space="0" w:color="B8B8B8"/>
-              <w:right w:val="single" w:sz="6" w:space="0" w:color="B8B8B8"/>
-            </w:tcBorders>
-            <w:tcMar>
-              <w:top w:w="90" w:type="dxa"/>
-              <w:start w:w="110" w:type="dxa"/>
-              <w:bottom w:w="90" w:type="dxa"/>
-              <w:end w:w="110" w:type="dxa"/>
-            </w:tcMar>
-          </w:tcPr>
           <w:p>
             <w:pPr>
-              <w:spacing w:before="0" w:after="0" w:line="259" w:lineRule="auto"/>
+              <w:spacing w:after="80"/>
             </w:pPr>
-            <w:r/>
             <w:r>
               <w:rPr>
-                <w:rFonts w:ascii="Arial" w:hAnsi="Arial" w:eastAsia="PingFang TC"/>
+                <w:rFonts w:ascii="Microsoft JhengHei" w:hAnsi="Microsoft JhengHei" w:eastAsia="Microsoft JhengHei"/>
                 <w:b w:val="0"/>
-                <w:color w:val="000000"/>
-                <w:sz w:val="17"/>
-              </w:rPr>
-              <w:t>大野狼</w:t>
-            </w:r>
-          </w:p>
-        </w:tc>
-        <w:tc>
-          <w:tcPr>
-            <w:tcW w:type="dxa" w:w="3000"/>
-            <w:tcBorders>
-              <w:top w:val="single" w:sz="6" w:space="0" w:color="B8B8B8"/>
-              <w:left w:val="single" w:sz="6" w:space="0" w:color="B8B8B8"/>
-              <w:bottom w:val="single" w:sz="6" w:space="0" w:color="B8B8B8"/>
-              <w:right w:val="single" w:sz="6" w:space="0" w:color="B8B8B8"/>
-            </w:tcBorders>
-            <w:tcMar>
-              <w:top w:w="90" w:type="dxa"/>
-              <w:start w:w="110" w:type="dxa"/>
-              <w:bottom w:w="90" w:type="dxa"/>
-              <w:end w:w="110" w:type="dxa"/>
-            </w:tcMar>
-          </w:tcPr>
-          <w:p>
-            <w:pPr>
-              <w:spacing w:before="0" w:after="0" w:line="259" w:lineRule="auto"/>
-            </w:pPr>
-            <w:r/>
-            <w:r>
-              <w:rPr>
-                <w:rFonts w:ascii="Arial" w:hAnsi="Arial" w:eastAsia="PingFang TC"/>
-                <w:b w:val="0"/>
-                <w:color w:val="000000"/>
-                <w:sz w:val="17"/>
+                <w:color w:val="202020"/>
+                <w:sz w:val="20"/>
               </w:rPr>
               <w:t>吹倒房子、威脅小豬。</w:t>
             </w:r>
           </w:p>
-        </w:tc>
-        <w:tc>
-          <w:tcPr>
-            <w:tcW w:type="dxa" w:w="2960"/>
-            <w:tcBorders>
-              <w:top w:val="single" w:sz="6" w:space="0" w:color="B8B8B8"/>
-              <w:left w:val="single" w:sz="6" w:space="0" w:color="B8B8B8"/>
-              <w:bottom w:val="single" w:sz="6" w:space="0" w:color="B8B8B8"/>
-              <w:right w:val="single" w:sz="6" w:space="0" w:color="B8B8B8"/>
-            </w:tcBorders>
-            <w:tcMar>
-              <w:top w:w="90" w:type="dxa"/>
-              <w:start w:w="110" w:type="dxa"/>
-              <w:bottom w:w="90" w:type="dxa"/>
-              <w:end w:w="110" w:type="dxa"/>
-            </w:tcMar>
-          </w:tcPr>
           <w:p>
             <w:pPr>
-              <w:spacing w:before="0" w:after="0" w:line="259" w:lineRule="auto"/>
+              <w:spacing w:before="40" w:after="20"/>
             </w:pPr>
-            <w:r/>
             <w:r>
               <w:rPr>
-                <w:rFonts w:ascii="Arial" w:hAnsi="Arial" w:eastAsia="PingFang TC"/>
+                <w:rFonts w:ascii="Microsoft JhengHei" w:hAnsi="Microsoft JhengHei" w:eastAsia="Microsoft JhengHei"/>
+                <w:b/>
+                <w:color w:val="A9782A"/>
+                <w:sz w:val="19"/>
+              </w:rPr>
+              <w:t>我注意到的細節或疑問：</w:t>
+            </w:r>
+          </w:p>
+          <w:p>
+            <w:pPr>
+              <w:spacing w:after="80"/>
+            </w:pPr>
+            <w:r>
+              <w:rPr>
+                <w:rFonts w:ascii="Microsoft JhengHei" w:hAnsi="Microsoft JhengHei" w:eastAsia="Microsoft JhengHei"/>
                 <w:b w:val="0"/>
-                <w:color w:val="000000"/>
-                <w:sz w:val="17"/>
+                <w:color w:val="202020"/>
+                <w:sz w:val="20"/>
               </w:rPr>
-              <w:t>牠可能飢餓，也不懂怎麼好好求助。</w:t>
+              <w:t>＿＿＿＿＿＿＿＿＿＿＿＿＿＿＿＿＿＿＿＿＿＿＿＿</w:t>
+            </w:r>
+          </w:p>
+          <w:p>
+            <w:pPr>
+              <w:spacing w:before="40" w:after="20"/>
+            </w:pPr>
+            <w:r>
+              <w:rPr>
+                <w:rFonts w:ascii="Microsoft JhengHei" w:hAnsi="Microsoft JhengHei" w:eastAsia="Microsoft JhengHei"/>
+                <w:b/>
+                <w:color w:val="A9782A"/>
+                <w:sz w:val="19"/>
+              </w:rPr>
+              <w:t>他／她可能害怕或想守護什麼？</w:t>
+            </w:r>
+          </w:p>
+          <w:p>
+            <w:pPr>
+              <w:spacing w:after="80"/>
+            </w:pPr>
+            <w:r>
+              <w:rPr>
+                <w:rFonts w:ascii="Microsoft JhengHei" w:hAnsi="Microsoft JhengHei" w:eastAsia="Microsoft JhengHei"/>
+                <w:b w:val="0"/>
+                <w:color w:val="202020"/>
+                <w:sz w:val="20"/>
+              </w:rPr>
+              <w:t>＿＿＿＿＿＿＿＿＿＿＿＿＿＿＿＿＿＿＿＿＿＿＿＿</w:t>
             </w:r>
           </w:p>
         </w:tc>
       </w:tr>
       <w:tr>
-        <w:tc>
-          <w:tcPr>
-            <w:tcW w:type="dxa" w:w="1700"/>
-            <w:tcBorders>
-              <w:top w:val="single" w:sz="6" w:space="0" w:color="B8B8B8"/>
-              <w:left w:val="single" w:sz="6" w:space="0" w:color="B8B8B8"/>
-              <w:bottom w:val="single" w:sz="6" w:space="0" w:color="B8B8B8"/>
-              <w:right w:val="single" w:sz="6" w:space="0" w:color="B8B8B8"/>
-            </w:tcBorders>
-            <w:tcMar>
-              <w:top w:w="90" w:type="dxa"/>
-              <w:start w:w="110" w:type="dxa"/>
-              <w:bottom w:w="90" w:type="dxa"/>
-              <w:end w:w="110" w:type="dxa"/>
-            </w:tcMar>
+        <w:trPr>
+          <w:trHeight w:val="2700" w:hRule="atLeast"/>
+        </w:trPr>
+        <w:tc>
+          <w:tcPr>
+            <w:tcW w:type="dxa" w:w="5188"/>
+            <w:vAlign w:val="top"/>
+            <w:tcMar>
+              <w:top w:w="100" w:type="dxa"/>
+              <w:start w:w="140" w:type="dxa"/>
+              <w:bottom w:w="100" w:type="dxa"/>
+              <w:end w:w="140" w:type="dxa"/>
+            </w:tcMar>
+            <w:tcBorders>
+              <w:top w:val="single" w:sz="10" w:space="0" w:color="B7B7B7"/>
+              <w:left w:val="single" w:sz="10" w:space="0" w:color="B7B7B7"/>
+              <w:bottom w:val="single" w:sz="10" w:space="0" w:color="B7B7B7"/>
+              <w:right w:val="single" w:sz="10" w:space="0" w:color="B7B7B7"/>
+            </w:tcBorders>
           </w:tcPr>
           <w:p>
             <w:pPr>
-              <w:spacing w:before="0" w:after="0" w:line="259" w:lineRule="auto"/>
+              <w:spacing w:after="80"/>
             </w:pPr>
             <w:r/>
             <w:r>
               <w:rPr>
-                <w:rFonts w:ascii="Arial" w:hAnsi="Arial" w:eastAsia="PingFang TC"/>
-                <w:b w:val="0"/>
-                <w:color w:val="000000"/>
-                <w:sz w:val="17"/>
+                <w:rFonts w:ascii="Microsoft JhengHei" w:hAnsi="Microsoft JhengHei" w:eastAsia="Microsoft JhengHei"/>
+                <w:b/>
+                <w:color w:val="174F3B"/>
+                <w:sz w:val="24"/>
               </w:rPr>
-              <w:t>白雪公主</w:t>
+              <w:t>□ 白雪公主的皇后</w:t>
             </w:r>
           </w:p>
-        </w:tc>
-        <w:tc>
-          <w:tcPr>
-            <w:tcW w:type="dxa" w:w="1700"/>
-            <w:tcBorders>
-              <w:top w:val="single" w:sz="6" w:space="0" w:color="B8B8B8"/>
-              <w:left w:val="single" w:sz="6" w:space="0" w:color="B8B8B8"/>
-              <w:bottom w:val="single" w:sz="6" w:space="0" w:color="B8B8B8"/>
-              <w:right w:val="single" w:sz="6" w:space="0" w:color="B8B8B8"/>
-            </w:tcBorders>
-            <w:tcMar>
-              <w:top w:w="90" w:type="dxa"/>
-              <w:start w:w="110" w:type="dxa"/>
-              <w:bottom w:w="90" w:type="dxa"/>
-              <w:end w:w="110" w:type="dxa"/>
-            </w:tcMar>
-          </w:tcPr>
           <w:p>
             <w:pPr>
-              <w:spacing w:before="0" w:after="0" w:line="259" w:lineRule="auto"/>
+              <w:spacing w:before="40" w:after="20"/>
             </w:pPr>
-            <w:r/>
             <w:r>
               <w:rPr>
-                <w:rFonts w:ascii="Arial" w:hAnsi="Arial" w:eastAsia="PingFang TC"/>
-                <w:b w:val="0"/>
-                <w:color w:val="000000"/>
-                <w:sz w:val="17"/>
+                <w:rFonts w:ascii="Microsoft JhengHei" w:hAnsi="Microsoft JhengHei" w:eastAsia="Microsoft JhengHei"/>
+                <w:b/>
+                <w:color w:val="A9782A"/>
+                <w:sz w:val="19"/>
               </w:rPr>
-              <w:t>皇后</w:t>
+              <w:t>他／她做了什麼？</w:t>
             </w:r>
           </w:p>
-        </w:tc>
-        <w:tc>
-          <w:tcPr>
-            <w:tcW w:type="dxa" w:w="3000"/>
-            <w:tcBorders>
-              <w:top w:val="single" w:sz="6" w:space="0" w:color="B8B8B8"/>
-              <w:left w:val="single" w:sz="6" w:space="0" w:color="B8B8B8"/>
-              <w:bottom w:val="single" w:sz="6" w:space="0" w:color="B8B8B8"/>
-              <w:right w:val="single" w:sz="6" w:space="0" w:color="B8B8B8"/>
-            </w:tcBorders>
-            <w:tcMar>
-              <w:top w:w="90" w:type="dxa"/>
-              <w:start w:w="110" w:type="dxa"/>
-              <w:bottom w:w="90" w:type="dxa"/>
-              <w:end w:w="110" w:type="dxa"/>
-            </w:tcMar>
-          </w:tcPr>
           <w:p>
             <w:pPr>
-              <w:spacing w:before="0" w:after="0" w:line="259" w:lineRule="auto"/>
+              <w:spacing w:after="80"/>
             </w:pPr>
-            <w:r/>
             <w:r>
               <w:rPr>
-                <w:rFonts w:ascii="Arial" w:hAnsi="Arial" w:eastAsia="PingFang TC"/>
+                <w:rFonts w:ascii="Microsoft JhengHei" w:hAnsi="Microsoft JhengHei" w:eastAsia="Microsoft JhengHei"/>
                 <w:b w:val="0"/>
-                <w:color w:val="000000"/>
-                <w:sz w:val="17"/>
+                <w:color w:val="202020"/>
+                <w:sz w:val="20"/>
               </w:rPr>
-              <w:t>嫉妒、想傷害白雪公主。</w:t>
+              <w:t>因為嫉妒，想把白雪公主趕走。</w:t>
             </w:r>
           </w:p>
-        </w:tc>
-        <w:tc>
-          <w:tcPr>
-            <w:tcW w:type="dxa" w:w="2960"/>
-            <w:tcBorders>
-              <w:top w:val="single" w:sz="6" w:space="0" w:color="B8B8B8"/>
-              <w:left w:val="single" w:sz="6" w:space="0" w:color="B8B8B8"/>
-              <w:bottom w:val="single" w:sz="6" w:space="0" w:color="B8B8B8"/>
-              <w:right w:val="single" w:sz="6" w:space="0" w:color="B8B8B8"/>
-            </w:tcBorders>
-            <w:tcMar>
-              <w:top w:w="90" w:type="dxa"/>
-              <w:start w:w="110" w:type="dxa"/>
-              <w:bottom w:w="90" w:type="dxa"/>
-              <w:end w:w="110" w:type="dxa"/>
-            </w:tcMar>
-          </w:tcPr>
           <w:p>
             <w:pPr>
-              <w:spacing w:before="0" w:after="0" w:line="259" w:lineRule="auto"/>
+              <w:spacing w:before="40" w:after="20"/>
             </w:pPr>
-            <w:r/>
             <w:r>
               <w:rPr>
-                <w:rFonts w:ascii="Arial" w:hAnsi="Arial" w:eastAsia="PingFang TC"/>
-                <w:b w:val="0"/>
-                <w:color w:val="000000"/>
-                <w:sz w:val="17"/>
+                <w:rFonts w:ascii="Microsoft JhengHei" w:hAnsi="Microsoft JhengHei" w:eastAsia="Microsoft JhengHei"/>
+                <w:b/>
+                <w:color w:val="A9782A"/>
+                <w:sz w:val="19"/>
               </w:rPr>
-              <w:t>她害怕變老、被取代，也太相信鏡子的答案。</w:t>
+              <w:t>我注意到的細節或疑問：</w:t>
             </w:r>
           </w:p>
-        </w:tc>
-      </w:tr>
-      <w:tr>
-        <w:tc>
-          <w:tcPr>
-            <w:tcW w:type="dxa" w:w="1700"/>
-            <w:tcBorders>
-              <w:top w:val="single" w:sz="6" w:space="0" w:color="B8B8B8"/>
-              <w:left w:val="single" w:sz="6" w:space="0" w:color="B8B8B8"/>
-              <w:bottom w:val="single" w:sz="6" w:space="0" w:color="B8B8B8"/>
-              <w:right w:val="single" w:sz="6" w:space="0" w:color="B8B8B8"/>
-            </w:tcBorders>
-            <w:tcMar>
-              <w:top w:w="90" w:type="dxa"/>
-              <w:start w:w="110" w:type="dxa"/>
-              <w:bottom w:w="90" w:type="dxa"/>
-              <w:end w:w="110" w:type="dxa"/>
-            </w:tcMar>
-          </w:tcPr>
           <w:p>
             <w:pPr>
-              <w:spacing w:before="0" w:after="0" w:line="259" w:lineRule="auto"/>
+              <w:spacing w:after="80"/>
             </w:pPr>
-            <w:r/>
             <w:r>
               <w:rPr>
-                <w:rFonts w:ascii="Arial" w:hAnsi="Arial" w:eastAsia="PingFang TC"/>
+                <w:rFonts w:ascii="Microsoft JhengHei" w:hAnsi="Microsoft JhengHei" w:eastAsia="Microsoft JhengHei"/>
                 <w:b w:val="0"/>
-                <w:color w:val="000000"/>
-                <w:sz w:val="17"/>
+                <w:color w:val="202020"/>
+                <w:sz w:val="20"/>
               </w:rPr>
-              <w:t>小紅帽</w:t>
+              <w:t>＿＿＿＿＿＿＿＿＿＿＿＿＿＿＿＿＿＿＿＿＿＿＿＿</w:t>
             </w:r>
           </w:p>
-        </w:tc>
-        <w:tc>
-          <w:tcPr>
-            <w:tcW w:type="dxa" w:w="1700"/>
-            <w:tcBorders>
-              <w:top w:val="single" w:sz="6" w:space="0" w:color="B8B8B8"/>
-              <w:left w:val="single" w:sz="6" w:space="0" w:color="B8B8B8"/>
-              <w:bottom w:val="single" w:sz="6" w:space="0" w:color="B8B8B8"/>
-              <w:right w:val="single" w:sz="6" w:space="0" w:color="B8B8B8"/>
-            </w:tcBorders>
-            <w:tcMar>
-              <w:top w:w="90" w:type="dxa"/>
-              <w:start w:w="110" w:type="dxa"/>
-              <w:bottom w:w="90" w:type="dxa"/>
-              <w:end w:w="110" w:type="dxa"/>
-            </w:tcMar>
-          </w:tcPr>
           <w:p>
             <w:pPr>
-              <w:spacing w:before="0" w:after="0" w:line="259" w:lineRule="auto"/>
+              <w:spacing w:before="40" w:after="20"/>
             </w:pPr>
-            <w:r/>
             <w:r>
               <w:rPr>
-                <w:rFonts w:ascii="Arial" w:hAnsi="Arial" w:eastAsia="PingFang TC"/>
-                <w:b w:val="0"/>
-                <w:color w:val="000000"/>
-                <w:sz w:val="17"/>
+                <w:rFonts w:ascii="Microsoft JhengHei" w:hAnsi="Microsoft JhengHei" w:eastAsia="Microsoft JhengHei"/>
+                <w:b/>
+                <w:color w:val="A9782A"/>
+                <w:sz w:val="19"/>
               </w:rPr>
-              <w:t>大野狼</w:t>
+              <w:t>他／她可能害怕或想守護什麼？</w:t>
             </w:r>
           </w:p>
-        </w:tc>
-        <w:tc>
-          <w:tcPr>
-            <w:tcW w:type="dxa" w:w="3000"/>
-            <w:tcBorders>
-              <w:top w:val="single" w:sz="6" w:space="0" w:color="B8B8B8"/>
-              <w:left w:val="single" w:sz="6" w:space="0" w:color="B8B8B8"/>
-              <w:bottom w:val="single" w:sz="6" w:space="0" w:color="B8B8B8"/>
-              <w:right w:val="single" w:sz="6" w:space="0" w:color="B8B8B8"/>
-            </w:tcBorders>
-            <w:tcMar>
-              <w:top w:w="90" w:type="dxa"/>
-              <w:start w:w="110" w:type="dxa"/>
-              <w:bottom w:w="90" w:type="dxa"/>
-              <w:end w:w="110" w:type="dxa"/>
-            </w:tcMar>
-          </w:tcPr>
           <w:p>
             <w:pPr>
-              <w:spacing w:before="0" w:after="0" w:line="259" w:lineRule="auto"/>
+              <w:spacing w:after="80"/>
             </w:pPr>
-            <w:r/>
             <w:r>
               <w:rPr>
-                <w:rFonts w:ascii="Arial" w:hAnsi="Arial" w:eastAsia="PingFang TC"/>
+                <w:rFonts w:ascii="Microsoft JhengHei" w:hAnsi="Microsoft JhengHei" w:eastAsia="Microsoft JhengHei"/>
                 <w:b w:val="0"/>
-                <w:color w:val="000000"/>
-                <w:sz w:val="17"/>
+                <w:color w:val="202020"/>
+                <w:sz w:val="20"/>
               </w:rPr>
-              <w:t>欺騙小紅帽，闖進外婆家。</w:t>
+              <w:t>＿＿＿＿＿＿＿＿＿＿＿＿＿＿＿＿＿＿＿＿＿＿＿＿</w:t>
             </w:r>
           </w:p>
         </w:tc>
         <w:tc>
           <w:tcPr>
-            <w:tcW w:type="dxa" w:w="2960"/>
-            <w:tcBorders>
-              <w:top w:val="single" w:sz="6" w:space="0" w:color="B8B8B8"/>
-              <w:left w:val="single" w:sz="6" w:space="0" w:color="B8B8B8"/>
-              <w:bottom w:val="single" w:sz="6" w:space="0" w:color="B8B8B8"/>
-              <w:right w:val="single" w:sz="6" w:space="0" w:color="B8B8B8"/>
-            </w:tcBorders>
-            <w:tcMar>
-              <w:top w:w="90" w:type="dxa"/>
-              <w:start w:w="110" w:type="dxa"/>
-              <w:bottom w:w="90" w:type="dxa"/>
-              <w:end w:w="110" w:type="dxa"/>
-            </w:tcMar>
+            <w:tcW w:type="dxa" w:w="5188"/>
+            <w:vAlign w:val="top"/>
+            <w:tcMar>
+              <w:top w:w="100" w:type="dxa"/>
+              <w:start w:w="140" w:type="dxa"/>
+              <w:bottom w:w="100" w:type="dxa"/>
+              <w:end w:w="140" w:type="dxa"/>
+            </w:tcMar>
+            <w:tcBorders>
+              <w:top w:val="single" w:sz="10" w:space="0" w:color="B7B7B7"/>
+              <w:left w:val="single" w:sz="10" w:space="0" w:color="B7B7B7"/>
+              <w:bottom w:val="single" w:sz="10" w:space="0" w:color="B7B7B7"/>
+              <w:right w:val="single" w:sz="10" w:space="0" w:color="B7B7B7"/>
+            </w:tcBorders>
           </w:tcPr>
           <w:p>
             <w:pPr>
-              <w:spacing w:before="0" w:after="0" w:line="259" w:lineRule="auto"/>
+              <w:spacing w:after="80"/>
             </w:pPr>
             <w:r/>
             <w:r>
               <w:rPr>
-                <w:rFonts w:ascii="Arial" w:hAnsi="Arial" w:eastAsia="PingFang TC"/>
-                <w:b w:val="0"/>
-                <w:color w:val="000000"/>
-                <w:sz w:val="17"/>
+                <w:rFonts w:ascii="Microsoft JhengHei" w:hAnsi="Microsoft JhengHei" w:eastAsia="Microsoft JhengHei"/>
+                <w:b/>
+                <w:color w:val="174F3B"/>
+                <w:sz w:val="24"/>
               </w:rPr>
-              <w:t>牠可能從來沒被人類相信過。</w:t>
+              <w:t>□ 小紅帽的大野狼</w:t>
             </w:r>
           </w:p>
-        </w:tc>
-      </w:tr>
-      <w:tr>
-        <w:tc>
-          <w:tcPr>
-            <w:tcW w:type="dxa" w:w="1700"/>
-            <w:tcBorders>
-              <w:top w:val="single" w:sz="6" w:space="0" w:color="B8B8B8"/>
-              <w:left w:val="single" w:sz="6" w:space="0" w:color="B8B8B8"/>
-              <w:bottom w:val="single" w:sz="6" w:space="0" w:color="B8B8B8"/>
-              <w:right w:val="single" w:sz="6" w:space="0" w:color="B8B8B8"/>
-            </w:tcBorders>
-            <w:tcMar>
-              <w:top w:w="90" w:type="dxa"/>
-              <w:start w:w="110" w:type="dxa"/>
-              <w:bottom w:w="90" w:type="dxa"/>
-              <w:end w:w="110" w:type="dxa"/>
-            </w:tcMar>
-          </w:tcPr>
           <w:p>
             <w:pPr>
-              <w:spacing w:before="0" w:after="0" w:line="259" w:lineRule="auto"/>
+              <w:spacing w:before="40" w:after="20"/>
             </w:pPr>
-            <w:r/>
             <w:r>
               <w:rPr>
-                <w:rFonts w:ascii="Arial" w:hAnsi="Arial" w:eastAsia="PingFang TC"/>
-                <w:b w:val="0"/>
-                <w:color w:val="000000"/>
-                <w:sz w:val="17"/>
+                <w:rFonts w:ascii="Microsoft JhengHei" w:hAnsi="Microsoft JhengHei" w:eastAsia="Microsoft JhengHei"/>
+                <w:b/>
+                <w:color w:val="A9782A"/>
+                <w:sz w:val="19"/>
               </w:rPr>
-              <w:t>虎姑婆／巫婆</w:t>
+              <w:t>他／她做了什麼？</w:t>
             </w:r>
           </w:p>
-        </w:tc>
-        <w:tc>
-          <w:tcPr>
-            <w:tcW w:type="dxa" w:w="1700"/>
-            <w:tcBorders>
-              <w:top w:val="single" w:sz="6" w:space="0" w:color="B8B8B8"/>
-              <w:left w:val="single" w:sz="6" w:space="0" w:color="B8B8B8"/>
-              <w:bottom w:val="single" w:sz="6" w:space="0" w:color="B8B8B8"/>
-              <w:right w:val="single" w:sz="6" w:space="0" w:color="B8B8B8"/>
-            </w:tcBorders>
-            <w:tcMar>
-              <w:top w:w="90" w:type="dxa"/>
-              <w:start w:w="110" w:type="dxa"/>
-              <w:bottom w:w="90" w:type="dxa"/>
-              <w:end w:w="110" w:type="dxa"/>
-            </w:tcMar>
-          </w:tcPr>
           <w:p>
             <w:pPr>
-              <w:spacing w:before="0" w:after="0" w:line="259" w:lineRule="auto"/>
+              <w:spacing w:after="80"/>
             </w:pPr>
-            <w:r/>
             <w:r>
               <w:rPr>
-                <w:rFonts w:ascii="Arial" w:hAnsi="Arial" w:eastAsia="PingFang TC"/>
+                <w:rFonts w:ascii="Microsoft JhengHei" w:hAnsi="Microsoft JhengHei" w:eastAsia="Microsoft JhengHei"/>
                 <w:b w:val="0"/>
-                <w:color w:val="000000"/>
-                <w:sz w:val="17"/>
+                <w:color w:val="202020"/>
+                <w:sz w:val="20"/>
               </w:rPr>
-              <w:t>虎姑婆或巫婆</w:t>
+              <w:t>欺騙小紅帽，又闖進外婆家。</w:t>
             </w:r>
           </w:p>
-        </w:tc>
-        <w:tc>
-          <w:tcPr>
-            <w:tcW w:type="dxa" w:w="3000"/>
-            <w:tcBorders>
-              <w:top w:val="single" w:sz="6" w:space="0" w:color="B8B8B8"/>
-              <w:left w:val="single" w:sz="6" w:space="0" w:color="B8B8B8"/>
-              <w:bottom w:val="single" w:sz="6" w:space="0" w:color="B8B8B8"/>
-              <w:right w:val="single" w:sz="6" w:space="0" w:color="B8B8B8"/>
-            </w:tcBorders>
-            <w:tcMar>
-              <w:top w:w="90" w:type="dxa"/>
-              <w:start w:w="110" w:type="dxa"/>
-              <w:bottom w:w="90" w:type="dxa"/>
-              <w:end w:w="110" w:type="dxa"/>
-            </w:tcMar>
-          </w:tcPr>
           <w:p>
             <w:pPr>
-              <w:spacing w:before="0" w:after="0" w:line="259" w:lineRule="auto"/>
+              <w:spacing w:before="40" w:after="20"/>
             </w:pPr>
-            <w:r/>
             <w:r>
               <w:rPr>
-                <w:rFonts w:ascii="Arial" w:hAnsi="Arial" w:eastAsia="PingFang TC"/>
-                <w:b w:val="0"/>
-                <w:color w:val="000000"/>
-                <w:sz w:val="17"/>
+                <w:rFonts w:ascii="Microsoft JhengHei" w:hAnsi="Microsoft JhengHei" w:eastAsia="Microsoft JhengHei"/>
+                <w:b/>
+                <w:color w:val="A9782A"/>
+                <w:sz w:val="19"/>
               </w:rPr>
-              <w:t>嚇人、設陷阱、傷害主角。</w:t>
+              <w:t>我注意到的細節或疑問：</w:t>
             </w:r>
           </w:p>
-        </w:tc>
-        <w:tc>
-          <w:tcPr>
-            <w:tcW w:type="dxa" w:w="2960"/>
-            <w:tcBorders>
-              <w:top w:val="single" w:sz="6" w:space="0" w:color="B8B8B8"/>
-              <w:left w:val="single" w:sz="6" w:space="0" w:color="B8B8B8"/>
-              <w:bottom w:val="single" w:sz="6" w:space="0" w:color="B8B8B8"/>
-              <w:right w:val="single" w:sz="6" w:space="0" w:color="B8B8B8"/>
-            </w:tcBorders>
-            <w:tcMar>
-              <w:top w:w="90" w:type="dxa"/>
-              <w:start w:w="110" w:type="dxa"/>
-              <w:bottom w:w="90" w:type="dxa"/>
-              <w:end w:w="110" w:type="dxa"/>
-            </w:tcMar>
-          </w:tcPr>
           <w:p>
             <w:pPr>
-              <w:spacing w:before="0" w:after="0" w:line="259" w:lineRule="auto"/>
+              <w:spacing w:after="80"/>
             </w:pPr>
-            <w:r/>
             <w:r>
               <w:rPr>
-                <w:rFonts w:ascii="Arial" w:hAnsi="Arial" w:eastAsia="PingFang TC"/>
+                <w:rFonts w:ascii="Microsoft JhengHei" w:hAnsi="Microsoft JhengHei" w:eastAsia="Microsoft JhengHei"/>
                 <w:b w:val="0"/>
-                <w:color w:val="000000"/>
-                <w:sz w:val="17"/>
+                <w:color w:val="202020"/>
+                <w:sz w:val="20"/>
               </w:rPr>
-              <w:t>她可能孤單、嫉妒、想被記得，卻選錯方法。</w:t>
+              <w:t>＿＿＿＿＿＿＿＿＿＿＿＿＿＿＿＿＿＿＿＿＿＿＿＿</w:t>
+            </w:r>
+          </w:p>
+          <w:p>
+            <w:pPr>
+              <w:spacing w:before="40" w:after="20"/>
+            </w:pPr>
+            <w:r>
+              <w:rPr>
+                <w:rFonts w:ascii="Microsoft JhengHei" w:hAnsi="Microsoft JhengHei" w:eastAsia="Microsoft JhengHei"/>
+                <w:b/>
+                <w:color w:val="A9782A"/>
+                <w:sz w:val="19"/>
+              </w:rPr>
+              <w:t>他／她可能害怕或想守護什麼？</w:t>
+            </w:r>
+          </w:p>
+          <w:p>
+            <w:pPr>
+              <w:spacing w:after="80"/>
+            </w:pPr>
+            <w:r>
+              <w:rPr>
+                <w:rFonts w:ascii="Microsoft JhengHei" w:hAnsi="Microsoft JhengHei" w:eastAsia="Microsoft JhengHei"/>
+                <w:b w:val="0"/>
+                <w:color w:val="202020"/>
+                <w:sz w:val="20"/>
+              </w:rPr>
+              <w:t>＿＿＿＿＿＿＿＿＿＿＿＿＿＿＿＿＿＿＿＿＿＿＿＿</w:t>
             </w:r>
           </w:p>
         </w:tc>

</xml_diff>

<commit_message>
Add story readings to chapter two workbook
</commit_message>
<xml_diff>
--- a/教材/學生練習本/第二章_學生練習本_反派有話要說.docx
+++ b/教材/學生練習本/第二章_學生練習本_反派有話要說.docx
@@ -1616,6 +1616,408 @@
         </w:tc>
       </w:tr>
     </w:tbl>
+    <w:p>
+      <w:r>
+        <w:br w:type="page"/>
+      </w:r>
+    </w:p>
+    <w:p>
+      <w:pPr>
+        <w:spacing w:before="0" w:after="60" w:line="372" w:lineRule="auto"/>
+      </w:pPr>
+      <w:r>
+        <w:rPr>
+          <w:rFonts w:ascii="Microsoft JhengHei" w:hAnsi="Microsoft JhengHei" w:eastAsia="Microsoft JhengHei"/>
+          <w:b/>
+          <w:color w:val="A9782A"/>
+          <w:sz w:val="21"/>
+        </w:rPr>
+        <w:t>故事 一・閱讀後再選</w:t>
+      </w:r>
+    </w:p>
+    <w:p>
+      <w:pPr>
+        <w:spacing w:before="0" w:after="160" w:line="372" w:lineRule="auto"/>
+      </w:pPr>
+      <w:r>
+        <w:rPr>
+          <w:rFonts w:ascii="Microsoft JhengHei" w:hAnsi="Microsoft JhengHei" w:eastAsia="Microsoft JhengHei"/>
+          <w:b/>
+          <w:color w:val="202020"/>
+          <w:sz w:val="46"/>
+        </w:rPr>
+        <w:t>三隻小豬：那隻一直敲門的狼</w:t>
+      </w:r>
+    </w:p>
+    <w:p>
+      <w:pPr>
+        <w:spacing w:before="0" w:after="280" w:line="372" w:lineRule="auto"/>
+      </w:pPr>
+      <w:r>
+        <w:rPr>
+          <w:rFonts w:ascii="Microsoft JhengHei" w:hAnsi="Microsoft JhengHei" w:eastAsia="Microsoft JhengHei"/>
+          <w:b w:val="0"/>
+          <w:color w:val="174F3B"/>
+          <w:sz w:val="23"/>
+        </w:rPr>
+        <w:t>理解牠的飢餓，不等於同意牠用威脅的方式對待小豬。</w:t>
+      </w:r>
+    </w:p>
+    <w:p>
+      <w:pPr>
+        <w:spacing w:before="0" w:after="200" w:line="372" w:lineRule="auto"/>
+        <w:ind w:firstLine="440"/>
+      </w:pPr>
+      <w:r>
+        <w:rPr>
+          <w:rFonts w:ascii="Microsoft JhengHei" w:hAnsi="Microsoft JhengHei" w:eastAsia="Microsoft JhengHei"/>
+          <w:b w:val="0"/>
+          <w:color w:val="202020"/>
+          <w:sz w:val="24"/>
+        </w:rPr>
+        <w:t>冬天快到了，大野狼已經兩天沒有找到食物。牠沿著森林邊緣走，看見三隻小豬各自蓋好房子；從第一間稻草屋裡飄出熱湯和麵包的味道。</w:t>
+      </w:r>
+    </w:p>
+    <w:p>
+      <w:pPr>
+        <w:spacing w:before="0" w:after="200" w:line="372" w:lineRule="auto"/>
+        <w:ind w:firstLine="440"/>
+      </w:pPr>
+      <w:r>
+        <w:rPr>
+          <w:rFonts w:ascii="Microsoft JhengHei" w:hAnsi="Microsoft JhengHei" w:eastAsia="Microsoft JhengHei"/>
+          <w:b w:val="0"/>
+          <w:color w:val="202020"/>
+          <w:sz w:val="24"/>
+        </w:rPr>
+        <w:t>牠先敲門，屋裡沒有回答。牠又大聲說話，可是小豬只把門鎖得更緊。牠越來越急，對著稻草屋吹了一口氣，房子倒了；小豬尖叫著逃往下一間屋子。</w:t>
+      </w:r>
+    </w:p>
+    <w:p>
+      <w:pPr>
+        <w:spacing w:before="0" w:after="200" w:line="372" w:lineRule="auto"/>
+        <w:ind w:firstLine="440"/>
+      </w:pPr>
+      <w:r>
+        <w:rPr>
+          <w:rFonts w:ascii="Microsoft JhengHei" w:hAnsi="Microsoft JhengHei" w:eastAsia="Microsoft JhengHei"/>
+          <w:b w:val="0"/>
+          <w:color w:val="202020"/>
+          <w:sz w:val="24"/>
+        </w:rPr>
+        <w:t>故事裡，大家只記得牠用力吹倒房子。可是，如果牠早一點知道怎麼開口求助，或者小豬願意隔著門遞給牠一點食物，這個下午會不會有別的結局？</w:t>
+      </w:r>
+    </w:p>
+    <w:p>
+      <w:pPr>
+        <w:spacing w:before="240" w:after="80" w:line="372" w:lineRule="auto"/>
+      </w:pPr>
+      <w:r>
+        <w:rPr>
+          <w:rFonts w:ascii="Microsoft JhengHei" w:hAnsi="Microsoft JhengHei" w:eastAsia="Microsoft JhengHei"/>
+          <w:b/>
+          <w:color w:val="174F3B"/>
+          <w:sz w:val="23"/>
+        </w:rPr>
+        <w:t>讀完先想一想：牠最需要的，是食物、幫忙，還是有人願意先聽牠說話？</w:t>
+      </w:r>
+    </w:p>
+    <w:p>
+      <w:pPr>
+        <w:spacing w:before="0" w:after="80" w:line="372" w:lineRule="auto"/>
+      </w:pPr>
+      <w:r>
+        <w:rPr>
+          <w:rFonts w:ascii="Microsoft JhengHei" w:hAnsi="Microsoft JhengHei" w:eastAsia="Microsoft JhengHei"/>
+          <w:b w:val="0"/>
+          <w:color w:val="202020"/>
+          <w:sz w:val="22"/>
+        </w:rPr>
+        <w:t>＿＿＿＿＿＿＿＿＿＿＿＿＿＿＿＿＿＿＿＿＿＿＿＿＿＿＿＿＿＿＿＿＿＿＿＿＿＿＿＿</w:t>
+      </w:r>
+    </w:p>
+    <w:p>
+      <w:pPr>
+        <w:spacing w:before="0" w:after="0" w:line="372" w:lineRule="auto"/>
+      </w:pPr>
+      <w:r>
+        <w:rPr>
+          <w:rFonts w:ascii="Microsoft JhengHei" w:hAnsi="Microsoft JhengHei" w:eastAsia="Microsoft JhengHei"/>
+          <w:b w:val="0"/>
+          <w:color w:val="202020"/>
+          <w:sz w:val="22"/>
+        </w:rPr>
+        <w:t>＿＿＿＿＿＿＿＿＿＿＿＿＿＿＿＿＿＿＿＿＿＿＿＿＿＿＿＿＿＿＿＿＿＿＿＿＿＿＿＿</w:t>
+      </w:r>
+    </w:p>
+    <w:p>
+      <w:r>
+        <w:br w:type="page"/>
+      </w:r>
+    </w:p>
+    <w:p>
+      <w:pPr>
+        <w:spacing w:before="0" w:after="60" w:line="372" w:lineRule="auto"/>
+      </w:pPr>
+      <w:r>
+        <w:rPr>
+          <w:rFonts w:ascii="Microsoft JhengHei" w:hAnsi="Microsoft JhengHei" w:eastAsia="Microsoft JhengHei"/>
+          <w:b/>
+          <w:color w:val="A9782A"/>
+          <w:sz w:val="21"/>
+        </w:rPr>
+        <w:t>故事 二・閱讀後再選</w:t>
+      </w:r>
+    </w:p>
+    <w:p>
+      <w:pPr>
+        <w:spacing w:before="0" w:after="160" w:line="372" w:lineRule="auto"/>
+      </w:pPr>
+      <w:r>
+        <w:rPr>
+          <w:rFonts w:ascii="Microsoft JhengHei" w:hAnsi="Microsoft JhengHei" w:eastAsia="Microsoft JhengHei"/>
+          <w:b/>
+          <w:color w:val="202020"/>
+          <w:sz w:val="46"/>
+        </w:rPr>
+        <w:t>白雪公主：每天問鏡子的皇后</w:t>
+      </w:r>
+    </w:p>
+    <w:p>
+      <w:pPr>
+        <w:spacing w:before="0" w:after="280" w:line="372" w:lineRule="auto"/>
+      </w:pPr>
+      <w:r>
+        <w:rPr>
+          <w:rFonts w:ascii="Microsoft JhengHei" w:hAnsi="Microsoft JhengHei" w:eastAsia="Microsoft JhengHei"/>
+          <w:b w:val="0"/>
+          <w:color w:val="174F3B"/>
+          <w:sz w:val="23"/>
+        </w:rPr>
+        <w:t>皇后的傷害行為沒有藉口，但日記可以讓她承認自己為何那麼害怕。</w:t>
+      </w:r>
+    </w:p>
+    <w:p>
+      <w:pPr>
+        <w:spacing w:before="0" w:after="200" w:line="372" w:lineRule="auto"/>
+        <w:ind w:firstLine="440"/>
+      </w:pPr>
+      <w:r>
+        <w:rPr>
+          <w:rFonts w:ascii="Microsoft JhengHei" w:hAnsi="Microsoft JhengHei" w:eastAsia="Microsoft JhengHei"/>
+          <w:b w:val="0"/>
+          <w:color w:val="202020"/>
+          <w:sz w:val="24"/>
+        </w:rPr>
+        <w:t>皇后每天都站在鏡子前，問同一個問題：「誰是世界上最美的人？」鏡子總是照實回答。直到有一天，它說白雪公主比她更美。</w:t>
+      </w:r>
+    </w:p>
+    <w:p>
+      <w:pPr>
+        <w:spacing w:before="0" w:after="200" w:line="372" w:lineRule="auto"/>
+        <w:ind w:firstLine="440"/>
+      </w:pPr>
+      <w:r>
+        <w:rPr>
+          <w:rFonts w:ascii="Microsoft JhengHei" w:hAnsi="Microsoft JhengHei" w:eastAsia="Microsoft JhengHei"/>
+          <w:b w:val="0"/>
+          <w:color w:val="202020"/>
+          <w:sz w:val="24"/>
+        </w:rPr>
+        <w:t>皇后愣在原地。她想起自己曾經被稱讚的日子，也想起那些因為她年紀漸長而不再停留的目光。她沒有把這份害怕告訴任何人，反而把它變成命令，要獵人帶白雪公主離開。</w:t>
+      </w:r>
+    </w:p>
+    <w:p>
+      <w:pPr>
+        <w:spacing w:before="0" w:after="200" w:line="372" w:lineRule="auto"/>
+        <w:ind w:firstLine="440"/>
+      </w:pPr>
+      <w:r>
+        <w:rPr>
+          <w:rFonts w:ascii="Microsoft JhengHei" w:hAnsi="Microsoft JhengHei" w:eastAsia="Microsoft JhengHei"/>
+          <w:b w:val="0"/>
+          <w:color w:val="202020"/>
+          <w:sz w:val="24"/>
+        </w:rPr>
+        <w:t>她的選擇傷害了別人，這件事沒有藉口。不過，若日記是她寫給自己的，也許她第一次能承認：她一直追著鏡子的答案，因為她不知道，除了「最美」，自己還剩下什麼。</w:t>
+      </w:r>
+    </w:p>
+    <w:p>
+      <w:pPr>
+        <w:spacing w:before="240" w:after="80" w:line="372" w:lineRule="auto"/>
+      </w:pPr>
+      <w:r>
+        <w:rPr>
+          <w:rFonts w:ascii="Microsoft JhengHei" w:hAnsi="Microsoft JhengHei" w:eastAsia="Microsoft JhengHei"/>
+          <w:b/>
+          <w:color w:val="174F3B"/>
+          <w:sz w:val="23"/>
+        </w:rPr>
+        <w:t>讀完先想一想：如果她不再問鏡子，她還能怎麼確認自己是有價值的人？</w:t>
+      </w:r>
+    </w:p>
+    <w:p>
+      <w:pPr>
+        <w:spacing w:before="0" w:after="80" w:line="372" w:lineRule="auto"/>
+      </w:pPr>
+      <w:r>
+        <w:rPr>
+          <w:rFonts w:ascii="Microsoft JhengHei" w:hAnsi="Microsoft JhengHei" w:eastAsia="Microsoft JhengHei"/>
+          <w:b w:val="0"/>
+          <w:color w:val="202020"/>
+          <w:sz w:val="22"/>
+        </w:rPr>
+        <w:t>＿＿＿＿＿＿＿＿＿＿＿＿＿＿＿＿＿＿＿＿＿＿＿＿＿＿＿＿＿＿＿＿＿＿＿＿＿＿＿＿</w:t>
+      </w:r>
+    </w:p>
+    <w:p>
+      <w:pPr>
+        <w:spacing w:before="0" w:after="0" w:line="372" w:lineRule="auto"/>
+      </w:pPr>
+      <w:r>
+        <w:rPr>
+          <w:rFonts w:ascii="Microsoft JhengHei" w:hAnsi="Microsoft JhengHei" w:eastAsia="Microsoft JhengHei"/>
+          <w:b w:val="0"/>
+          <w:color w:val="202020"/>
+          <w:sz w:val="22"/>
+        </w:rPr>
+        <w:t>＿＿＿＿＿＿＿＿＿＿＿＿＿＿＿＿＿＿＿＿＿＿＿＿＿＿＿＿＿＿＿＿＿＿＿＿＿＿＿＿</w:t>
+      </w:r>
+    </w:p>
+    <w:p>
+      <w:r>
+        <w:br w:type="page"/>
+      </w:r>
+    </w:p>
+    <w:p>
+      <w:pPr>
+        <w:spacing w:before="0" w:after="60" w:line="372" w:lineRule="auto"/>
+      </w:pPr>
+      <w:r>
+        <w:rPr>
+          <w:rFonts w:ascii="Microsoft JhengHei" w:hAnsi="Microsoft JhengHei" w:eastAsia="Microsoft JhengHei"/>
+          <w:b/>
+          <w:color w:val="A9782A"/>
+          <w:sz w:val="21"/>
+        </w:rPr>
+        <w:t>故事 三・閱讀後再選</w:t>
+      </w:r>
+    </w:p>
+    <w:p>
+      <w:pPr>
+        <w:spacing w:before="0" w:after="160" w:line="372" w:lineRule="auto"/>
+      </w:pPr>
+      <w:r>
+        <w:rPr>
+          <w:rFonts w:ascii="Microsoft JhengHei" w:hAnsi="Microsoft JhengHei" w:eastAsia="Microsoft JhengHei"/>
+          <w:b/>
+          <w:color w:val="202020"/>
+          <w:sz w:val="46"/>
+        </w:rPr>
+        <w:t>小紅帽：森林裡那隻大野狼</w:t>
+      </w:r>
+    </w:p>
+    <w:p>
+      <w:pPr>
+        <w:spacing w:before="0" w:after="280" w:line="372" w:lineRule="auto"/>
+      </w:pPr>
+      <w:r>
+        <w:rPr>
+          <w:rFonts w:ascii="Microsoft JhengHei" w:hAnsi="Microsoft JhengHei" w:eastAsia="Microsoft JhengHei"/>
+          <w:b w:val="0"/>
+          <w:color w:val="174F3B"/>
+          <w:sz w:val="23"/>
+        </w:rPr>
+        <w:t>被誤解的感覺可以被寫出來，但欺騙與闖入別人家仍然是錯的。</w:t>
+      </w:r>
+    </w:p>
+    <w:p>
+      <w:pPr>
+        <w:spacing w:before="0" w:after="200" w:line="372" w:lineRule="auto"/>
+        <w:ind w:firstLine="440"/>
+      </w:pPr>
+      <w:r>
+        <w:rPr>
+          <w:rFonts w:ascii="Microsoft JhengHei" w:hAnsi="Microsoft JhengHei" w:eastAsia="Microsoft JhengHei"/>
+          <w:b w:val="0"/>
+          <w:color w:val="202020"/>
+          <w:sz w:val="24"/>
+        </w:rPr>
+        <w:t>森林邊的小路常有人經過，可是沒有人願意靠近大野狼。只要遠遠看見牠，獵人就把手放到弓上，孩子也被大人拉到身後。</w:t>
+      </w:r>
+    </w:p>
+    <w:p>
+      <w:pPr>
+        <w:spacing w:before="0" w:after="200" w:line="372" w:lineRule="auto"/>
+        <w:ind w:firstLine="440"/>
+      </w:pPr>
+      <w:r>
+        <w:rPr>
+          <w:rFonts w:ascii="Microsoft JhengHei" w:hAnsi="Microsoft JhengHei" w:eastAsia="Microsoft JhengHei"/>
+          <w:b w:val="0"/>
+          <w:color w:val="202020"/>
+          <w:sz w:val="24"/>
+        </w:rPr>
+        <w:t>那天，小紅帽提著籃子走進森林。狼聞到麵包和奶油的味道，也聽見她說要去看外婆。牠沒有好好問能不能得到一點食物，而是用話把她騙去採花，自己先跑到外婆家。</w:t>
+      </w:r>
+    </w:p>
+    <w:p>
+      <w:pPr>
+        <w:spacing w:before="0" w:after="200" w:line="372" w:lineRule="auto"/>
+        <w:ind w:firstLine="440"/>
+      </w:pPr>
+      <w:r>
+        <w:rPr>
+          <w:rFonts w:ascii="Microsoft JhengHei" w:hAnsi="Microsoft JhengHei" w:eastAsia="Microsoft JhengHei"/>
+          <w:b w:val="0"/>
+          <w:color w:val="202020"/>
+          <w:sz w:val="24"/>
+        </w:rPr>
+        <w:t>牠做錯了，還讓外婆和小紅帽害怕。但如果牠要寫一篇日記，也許會寫：牠太習慣被當成怪物，於是先把每個人都當成敵人，最後真的做出了怪物會做的事。</w:t>
+      </w:r>
+    </w:p>
+    <w:p>
+      <w:pPr>
+        <w:spacing w:before="240" w:after="80" w:line="372" w:lineRule="auto"/>
+      </w:pPr>
+      <w:r>
+        <w:rPr>
+          <w:rFonts w:ascii="Microsoft JhengHei" w:hAnsi="Microsoft JhengHei" w:eastAsia="Microsoft JhengHei"/>
+          <w:b/>
+          <w:color w:val="174F3B"/>
+          <w:sz w:val="23"/>
+        </w:rPr>
+        <w:t>讀完先想一想：牠認為自己只有「先下手」這條路時，還可能有什麼選擇？</w:t>
+      </w:r>
+    </w:p>
+    <w:p>
+      <w:pPr>
+        <w:spacing w:before="0" w:after="80" w:line="372" w:lineRule="auto"/>
+      </w:pPr>
+      <w:r>
+        <w:rPr>
+          <w:rFonts w:ascii="Microsoft JhengHei" w:hAnsi="Microsoft JhengHei" w:eastAsia="Microsoft JhengHei"/>
+          <w:b w:val="0"/>
+          <w:color w:val="202020"/>
+          <w:sz w:val="22"/>
+        </w:rPr>
+        <w:t>＿＿＿＿＿＿＿＿＿＿＿＿＿＿＿＿＿＿＿＿＿＿＿＿＿＿＿＿＿＿＿＿＿＿＿＿＿＿＿＿</w:t>
+      </w:r>
+    </w:p>
+    <w:p>
+      <w:pPr>
+        <w:spacing w:before="0" w:after="0" w:line="372" w:lineRule="auto"/>
+      </w:pPr>
+      <w:r>
+        <w:rPr>
+          <w:rFonts w:ascii="Microsoft JhengHei" w:hAnsi="Microsoft JhengHei" w:eastAsia="Microsoft JhengHei"/>
+          <w:b w:val="0"/>
+          <w:color w:val="202020"/>
+          <w:sz w:val="22"/>
+        </w:rPr>
+        <w:t>＿＿＿＿＿＿＿＿＿＿＿＿＿＿＿＿＿＿＿＿＿＿＿＿＿＿＿＿＿＿＿＿＿＿＿＿＿＿＿＿</w:t>
+      </w:r>
+    </w:p>
     <w:p>
       <w:r>
         <w:br w:type="page"/>

</xml_diff>

<commit_message>
Compare original and alternate fairy tale stories
</commit_message>
<xml_diff>
--- a/教材/學生練習本/第二章_學生練習本_反派有話要說.docx
+++ b/教材/學生練習本/第二章_學生練習本_反派有話要說.docx
@@ -1623,6 +1623,168 @@
     </w:p>
     <w:p>
       <w:pPr>
+        <w:spacing w:before="0" w:after="60" w:line="355" w:lineRule="auto"/>
+      </w:pPr>
+      <w:r>
+        <w:rPr>
+          <w:rFonts w:ascii="Microsoft JhengHei" w:hAnsi="Microsoft JhengHei" w:eastAsia="Microsoft JhengHei"/>
+          <w:b/>
+          <w:color w:val="A9782A"/>
+          <w:sz w:val="21"/>
+        </w:rPr>
+        <w:t>故事 一A・原本的故事</w:t>
+      </w:r>
+    </w:p>
+    <w:p>
+      <w:pPr>
+        <w:spacing w:before="0" w:after="120" w:line="355" w:lineRule="auto"/>
+      </w:pPr>
+      <w:r>
+        <w:rPr>
+          <w:rFonts w:ascii="Microsoft JhengHei" w:hAnsi="Microsoft JhengHei" w:eastAsia="Microsoft JhengHei"/>
+          <w:b/>
+          <w:color w:val="202020"/>
+          <w:sz w:val="44"/>
+        </w:rPr>
+        <w:t>三隻小豬：原本的故事怎麼寫？</w:t>
+      </w:r>
+    </w:p>
+    <w:p>
+      <w:pPr>
+        <w:spacing w:before="0" w:after="220" w:line="355" w:lineRule="auto"/>
+      </w:pPr>
+      <w:r>
+        <w:rPr>
+          <w:rFonts w:ascii="Microsoft JhengHei" w:hAnsi="Microsoft JhengHei" w:eastAsia="Microsoft JhengHei"/>
+          <w:b w:val="0"/>
+          <w:color w:val="174F3B"/>
+          <w:sz w:val="22"/>
+        </w:rPr>
+        <w:t>先讀熟悉的版本，再留意：狼在這裡只有行動，幾乎沒有心聲。</w:t>
+      </w:r>
+    </w:p>
+    <w:p>
+      <w:pPr>
+        <w:spacing w:before="0" w:after="160" w:line="355" w:lineRule="auto"/>
+        <w:ind w:firstLine="440"/>
+      </w:pPr>
+      <w:r>
+        <w:rPr>
+          <w:rFonts w:ascii="Microsoft JhengHei" w:hAnsi="Microsoft JhengHei" w:eastAsia="Microsoft JhengHei"/>
+          <w:b w:val="0"/>
+          <w:color w:val="202020"/>
+          <w:sz w:val="23"/>
+        </w:rPr>
+        <w:t>三隻小豬離開家，各自在森林裡蓋房子。第一隻用稻草，第二隻用木頭，第三隻花了很久，用磚頭蓋出結實的房子。</w:t>
+      </w:r>
+    </w:p>
+    <w:p>
+      <w:pPr>
+        <w:spacing w:before="0" w:after="160" w:line="355" w:lineRule="auto"/>
+        <w:ind w:firstLine="440"/>
+      </w:pPr>
+      <w:r>
+        <w:rPr>
+          <w:rFonts w:ascii="Microsoft JhengHei" w:hAnsi="Microsoft JhengHei" w:eastAsia="Microsoft JhengHei"/>
+          <w:b w:val="0"/>
+          <w:color w:val="202020"/>
+          <w:sz w:val="23"/>
+        </w:rPr>
+        <w:t>大野狼來到稻草屋前，說要吹倒房子。牠一吹，稻草屋就倒了；小豬逃到木頭屋。狼又吹倒木頭屋，兩隻小豬只好一起逃進磚頭屋。</w:t>
+      </w:r>
+    </w:p>
+    <w:p>
+      <w:pPr>
+        <w:spacing w:before="0" w:after="160" w:line="355" w:lineRule="auto"/>
+        <w:ind w:firstLine="440"/>
+      </w:pPr>
+      <w:r>
+        <w:rPr>
+          <w:rFonts w:ascii="Microsoft JhengHei" w:hAnsi="Microsoft JhengHei" w:eastAsia="Microsoft JhengHei"/>
+          <w:b w:val="0"/>
+          <w:color w:val="202020"/>
+          <w:sz w:val="23"/>
+        </w:rPr>
+        <w:t>磚頭屋怎麼吹都不倒。狼想從煙囪進去，最後沒有成功，只能離開。原本的故事把重點放在小豬的勤勞與安全，也把狼寫成一個只想傷害人的敵人。</w:t>
+      </w:r>
+    </w:p>
+    <w:p>
+      <w:pPr>
+        <w:spacing w:before="160" w:after="60" w:line="355" w:lineRule="auto"/>
+      </w:pPr>
+      <w:r>
+        <w:rPr>
+          <w:rFonts w:ascii="Microsoft JhengHei" w:hAnsi="Microsoft JhengHei" w:eastAsia="Microsoft JhengHei"/>
+          <w:b/>
+          <w:color w:val="174F3B"/>
+          <w:sz w:val="23"/>
+        </w:rPr>
+        <w:t>閱讀時，先抓住原故事給你的線索</w:t>
+      </w:r>
+    </w:p>
+    <w:p>
+      <w:pPr>
+        <w:spacing w:before="0" w:after="20" w:line="355" w:lineRule="auto"/>
+      </w:pPr>
+      <w:r>
+        <w:rPr>
+          <w:rFonts w:ascii="Microsoft JhengHei" w:hAnsi="Microsoft JhengHei" w:eastAsia="Microsoft JhengHei"/>
+          <w:b/>
+          <w:color w:val="202020"/>
+          <w:sz w:val="21"/>
+        </w:rPr>
+        <w:t>□ 狼一出現，做了哪兩件事，讓讀者立刻站到小豬那一邊？</w:t>
+      </w:r>
+    </w:p>
+    <w:p>
+      <w:pPr>
+        <w:spacing w:before="0" w:after="60" w:line="355" w:lineRule="auto"/>
+      </w:pPr>
+      <w:r>
+        <w:rPr>
+          <w:rFonts w:ascii="Microsoft JhengHei" w:hAnsi="Microsoft JhengHei" w:eastAsia="Microsoft JhengHei"/>
+          <w:b w:val="0"/>
+          <w:color w:val="202020"/>
+          <w:sz w:val="21"/>
+        </w:rPr>
+        <w:t>＿＿＿＿＿＿＿＿＿＿＿＿＿＿＿＿＿＿＿＿＿＿＿＿＿＿＿＿＿＿＿＿＿＿＿＿</w:t>
+      </w:r>
+    </w:p>
+    <w:p>
+      <w:pPr>
+        <w:spacing w:before="0" w:after="20" w:line="355" w:lineRule="auto"/>
+      </w:pPr>
+      <w:r>
+        <w:rPr>
+          <w:rFonts w:ascii="Microsoft JhengHei" w:hAnsi="Microsoft JhengHei" w:eastAsia="Microsoft JhengHei"/>
+          <w:b/>
+          <w:color w:val="202020"/>
+          <w:sz w:val="21"/>
+        </w:rPr>
+        <w:t>□ 原故事沒有告訴我們狼的哪一種心情或原因？</w:t>
+      </w:r>
+    </w:p>
+    <w:p>
+      <w:pPr>
+        <w:spacing w:before="0" w:after="60" w:line="355" w:lineRule="auto"/>
+      </w:pPr>
+      <w:r>
+        <w:rPr>
+          <w:rFonts w:ascii="Microsoft JhengHei" w:hAnsi="Microsoft JhengHei" w:eastAsia="Microsoft JhengHei"/>
+          <w:b w:val="0"/>
+          <w:color w:val="202020"/>
+          <w:sz w:val="21"/>
+        </w:rPr>
+        <w:t>＿＿＿＿＿＿＿＿＿＿＿＿＿＿＿＿＿＿＿＿＿＿＿＿＿＿＿＿＿＿＿＿＿＿＿＿</w:t>
+      </w:r>
+    </w:p>
+    <w:p>
+      <w:r>
+        <w:br w:type="page"/>
+      </w:r>
+    </w:p>
+    <w:p>
+      <w:pPr>
         <w:spacing w:before="0" w:after="60" w:line="372" w:lineRule="auto"/>
       </w:pPr>
       <w:r>
@@ -1632,7 +1794,7 @@
           <w:color w:val="A9782A"/>
           <w:sz w:val="21"/>
         </w:rPr>
-        <w:t>故事 一・閱讀後再選</w:t>
+        <w:t>故事 一B・換個角度</w:t>
       </w:r>
     </w:p>
     <w:p>
@@ -1757,6 +1919,168 @@
     </w:p>
     <w:p>
       <w:pPr>
+        <w:spacing w:before="0" w:after="60" w:line="355" w:lineRule="auto"/>
+      </w:pPr>
+      <w:r>
+        <w:rPr>
+          <w:rFonts w:ascii="Microsoft JhengHei" w:hAnsi="Microsoft JhengHei" w:eastAsia="Microsoft JhengHei"/>
+          <w:b/>
+          <w:color w:val="A9782A"/>
+          <w:sz w:val="21"/>
+        </w:rPr>
+        <w:t>故事 二A・原本的故事</w:t>
+      </w:r>
+    </w:p>
+    <w:p>
+      <w:pPr>
+        <w:spacing w:before="0" w:after="120" w:line="355" w:lineRule="auto"/>
+      </w:pPr>
+      <w:r>
+        <w:rPr>
+          <w:rFonts w:ascii="Microsoft JhengHei" w:hAnsi="Microsoft JhengHei" w:eastAsia="Microsoft JhengHei"/>
+          <w:b/>
+          <w:color w:val="202020"/>
+          <w:sz w:val="44"/>
+        </w:rPr>
+        <w:t>白雪公主：原本的故事怎麼寫？</w:t>
+      </w:r>
+    </w:p>
+    <w:p>
+      <w:pPr>
+        <w:spacing w:before="0" w:after="220" w:line="355" w:lineRule="auto"/>
+      </w:pPr>
+      <w:r>
+        <w:rPr>
+          <w:rFonts w:ascii="Microsoft JhengHei" w:hAnsi="Microsoft JhengHei" w:eastAsia="Microsoft JhengHei"/>
+          <w:b w:val="0"/>
+          <w:color w:val="174F3B"/>
+          <w:sz w:val="22"/>
+        </w:rPr>
+        <w:t>原故事先讓皇后問鏡子，再讓她做出傷害人的選擇；讀者很少聽到她說話。</w:t>
+      </w:r>
+    </w:p>
+    <w:p>
+      <w:pPr>
+        <w:spacing w:before="0" w:after="160" w:line="355" w:lineRule="auto"/>
+        <w:ind w:firstLine="440"/>
+      </w:pPr>
+      <w:r>
+        <w:rPr>
+          <w:rFonts w:ascii="Microsoft JhengHei" w:hAnsi="Microsoft JhengHei" w:eastAsia="Microsoft JhengHei"/>
+          <w:b w:val="0"/>
+          <w:color w:val="202020"/>
+          <w:sz w:val="23"/>
+        </w:rPr>
+        <w:t>皇后每天都問魔鏡：「誰是世界上最美的人？」鏡子總回答皇后。直到白雪公主長大，鏡子說白雪公主比皇后更美。</w:t>
+      </w:r>
+    </w:p>
+    <w:p>
+      <w:pPr>
+        <w:spacing w:before="0" w:after="160" w:line="355" w:lineRule="auto"/>
+        <w:ind w:firstLine="440"/>
+      </w:pPr>
+      <w:r>
+        <w:rPr>
+          <w:rFonts w:ascii="Microsoft JhengHei" w:hAnsi="Microsoft JhengHei" w:eastAsia="Microsoft JhengHei"/>
+          <w:b w:val="0"/>
+          <w:color w:val="202020"/>
+          <w:sz w:val="23"/>
+        </w:rPr>
+        <w:t>皇后非常嫉妒，命令獵人把白雪公主帶進森林。獵人不忍心傷害她，白雪公主便逃到七個小矮人的家。皇后知道後，又假扮成別人，用毒蘋果讓白雪公主倒下。</w:t>
+      </w:r>
+    </w:p>
+    <w:p>
+      <w:pPr>
+        <w:spacing w:before="0" w:after="160" w:line="355" w:lineRule="auto"/>
+        <w:ind w:firstLine="440"/>
+      </w:pPr>
+      <w:r>
+        <w:rPr>
+          <w:rFonts w:ascii="Microsoft JhengHei" w:hAnsi="Microsoft JhengHei" w:eastAsia="Microsoft JhengHei"/>
+          <w:b w:val="0"/>
+          <w:color w:val="202020"/>
+          <w:sz w:val="23"/>
+        </w:rPr>
+        <w:t>後來白雪公主醒來，和王子離開。原本的故事把皇后寫成嫉妒又危險的人；魔鏡的回答像是一道命令，卻沒有人問皇后除了美麗，還想被看見什麼。</w:t>
+      </w:r>
+    </w:p>
+    <w:p>
+      <w:pPr>
+        <w:spacing w:before="160" w:after="60" w:line="355" w:lineRule="auto"/>
+      </w:pPr>
+      <w:r>
+        <w:rPr>
+          <w:rFonts w:ascii="Microsoft JhengHei" w:hAnsi="Microsoft JhengHei" w:eastAsia="Microsoft JhengHei"/>
+          <w:b/>
+          <w:color w:val="174F3B"/>
+          <w:sz w:val="23"/>
+        </w:rPr>
+        <w:t>閱讀時，先抓住原故事給你的線索</w:t>
+      </w:r>
+    </w:p>
+    <w:p>
+      <w:pPr>
+        <w:spacing w:before="0" w:after="20" w:line="355" w:lineRule="auto"/>
+      </w:pPr>
+      <w:r>
+        <w:rPr>
+          <w:rFonts w:ascii="Microsoft JhengHei" w:hAnsi="Microsoft JhengHei" w:eastAsia="Microsoft JhengHei"/>
+          <w:b/>
+          <w:color w:val="202020"/>
+          <w:sz w:val="21"/>
+        </w:rPr>
+        <w:t>□ 故事把皇后最在意的事情寫成什麼？</w:t>
+      </w:r>
+    </w:p>
+    <w:p>
+      <w:pPr>
+        <w:spacing w:before="0" w:after="60" w:line="355" w:lineRule="auto"/>
+      </w:pPr>
+      <w:r>
+        <w:rPr>
+          <w:rFonts w:ascii="Microsoft JhengHei" w:hAnsi="Microsoft JhengHei" w:eastAsia="Microsoft JhengHei"/>
+          <w:b w:val="0"/>
+          <w:color w:val="202020"/>
+          <w:sz w:val="21"/>
+        </w:rPr>
+        <w:t>＿＿＿＿＿＿＿＿＿＿＿＿＿＿＿＿＿＿＿＿＿＿＿＿＿＿＿＿＿＿＿＿＿＿＿＿</w:t>
+      </w:r>
+    </w:p>
+    <w:p>
+      <w:pPr>
+        <w:spacing w:before="0" w:after="20" w:line="355" w:lineRule="auto"/>
+      </w:pPr>
+      <w:r>
+        <w:rPr>
+          <w:rFonts w:ascii="Microsoft JhengHei" w:hAnsi="Microsoft JhengHei" w:eastAsia="Microsoft JhengHei"/>
+          <w:b/>
+          <w:color w:val="202020"/>
+          <w:sz w:val="21"/>
+        </w:rPr>
+        <w:t>□ 如果要理解她的恐懼，原故事還少了哪一句心裡話？</w:t>
+      </w:r>
+    </w:p>
+    <w:p>
+      <w:pPr>
+        <w:spacing w:before="0" w:after="60" w:line="355" w:lineRule="auto"/>
+      </w:pPr>
+      <w:r>
+        <w:rPr>
+          <w:rFonts w:ascii="Microsoft JhengHei" w:hAnsi="Microsoft JhengHei" w:eastAsia="Microsoft JhengHei"/>
+          <w:b w:val="0"/>
+          <w:color w:val="202020"/>
+          <w:sz w:val="21"/>
+        </w:rPr>
+        <w:t>＿＿＿＿＿＿＿＿＿＿＿＿＿＿＿＿＿＿＿＿＿＿＿＿＿＿＿＿＿＿＿＿＿＿＿＿</w:t>
+      </w:r>
+    </w:p>
+    <w:p>
+      <w:r>
+        <w:br w:type="page"/>
+      </w:r>
+    </w:p>
+    <w:p>
+      <w:pPr>
         <w:spacing w:before="0" w:after="60" w:line="372" w:lineRule="auto"/>
       </w:pPr>
       <w:r>
@@ -1766,7 +2090,7 @@
           <w:color w:val="A9782A"/>
           <w:sz w:val="21"/>
         </w:rPr>
-        <w:t>故事 二・閱讀後再選</w:t>
+        <w:t>故事 二B・換個角度</w:t>
       </w:r>
     </w:p>
     <w:p>
@@ -1891,6 +2215,168 @@
     </w:p>
     <w:p>
       <w:pPr>
+        <w:spacing w:before="0" w:after="60" w:line="355" w:lineRule="auto"/>
+      </w:pPr>
+      <w:r>
+        <w:rPr>
+          <w:rFonts w:ascii="Microsoft JhengHei" w:hAnsi="Microsoft JhengHei" w:eastAsia="Microsoft JhengHei"/>
+          <w:b/>
+          <w:color w:val="A9782A"/>
+          <w:sz w:val="21"/>
+        </w:rPr>
+        <w:t>故事 三A・原本的故事</w:t>
+      </w:r>
+    </w:p>
+    <w:p>
+      <w:pPr>
+        <w:spacing w:before="0" w:after="120" w:line="355" w:lineRule="auto"/>
+      </w:pPr>
+      <w:r>
+        <w:rPr>
+          <w:rFonts w:ascii="Microsoft JhengHei" w:hAnsi="Microsoft JhengHei" w:eastAsia="Microsoft JhengHei"/>
+          <w:b/>
+          <w:color w:val="202020"/>
+          <w:sz w:val="44"/>
+        </w:rPr>
+        <w:t>小紅帽：原本的故事怎麼寫？</w:t>
+      </w:r>
+    </w:p>
+    <w:p>
+      <w:pPr>
+        <w:spacing w:before="0" w:after="220" w:line="355" w:lineRule="auto"/>
+      </w:pPr>
+      <w:r>
+        <w:rPr>
+          <w:rFonts w:ascii="Microsoft JhengHei" w:hAnsi="Microsoft JhengHei" w:eastAsia="Microsoft JhengHei"/>
+          <w:b w:val="0"/>
+          <w:color w:val="174F3B"/>
+          <w:sz w:val="22"/>
+        </w:rPr>
+        <w:t>不同版本的結局不一樣；這裡採常見版本，先看狼如何被寫成狡猾又危險。</w:t>
+      </w:r>
+    </w:p>
+    <w:p>
+      <w:pPr>
+        <w:spacing w:before="0" w:after="160" w:line="355" w:lineRule="auto"/>
+        <w:ind w:firstLine="440"/>
+      </w:pPr>
+      <w:r>
+        <w:rPr>
+          <w:rFonts w:ascii="Microsoft JhengHei" w:hAnsi="Microsoft JhengHei" w:eastAsia="Microsoft JhengHei"/>
+          <w:b w:val="0"/>
+          <w:color w:val="202020"/>
+          <w:sz w:val="23"/>
+        </w:rPr>
+        <w:t>小紅帽帶著食物，要穿過森林去看外婆。大野狼在路上遇見她，先問出外婆住在哪裡，又故意叫她去採花。</w:t>
+      </w:r>
+    </w:p>
+    <w:p>
+      <w:pPr>
+        <w:spacing w:before="0" w:after="160" w:line="355" w:lineRule="auto"/>
+        <w:ind w:firstLine="440"/>
+      </w:pPr>
+      <w:r>
+        <w:rPr>
+          <w:rFonts w:ascii="Microsoft JhengHei" w:hAnsi="Microsoft JhengHei" w:eastAsia="Microsoft JhengHei"/>
+          <w:b w:val="0"/>
+          <w:color w:val="202020"/>
+          <w:sz w:val="23"/>
+        </w:rPr>
+        <w:t>狼搶先跑到外婆家，把外婆關起來，自己披上外婆的衣服等待小紅帽。小紅帽進門後，覺得外婆的眼睛、耳朵和牙齒都很奇怪，才發現眼前不是外婆。</w:t>
+      </w:r>
+    </w:p>
+    <w:p>
+      <w:pPr>
+        <w:spacing w:before="0" w:after="160" w:line="355" w:lineRule="auto"/>
+        <w:ind w:firstLine="440"/>
+      </w:pPr>
+      <w:r>
+        <w:rPr>
+          <w:rFonts w:ascii="Microsoft JhengHei" w:hAnsi="Microsoft JhengHei" w:eastAsia="Microsoft JhengHei"/>
+          <w:b w:val="0"/>
+          <w:color w:val="202020"/>
+          <w:sz w:val="23"/>
+        </w:rPr>
+        <w:t>獵人聽見動靜，趕來救出外婆和小紅帽。原本的故事提醒孩子不要輕信陌生人，也把狼寫成狡猾、會設陷阱的壞角色。</w:t>
+      </w:r>
+    </w:p>
+    <w:p>
+      <w:pPr>
+        <w:spacing w:before="160" w:after="60" w:line="355" w:lineRule="auto"/>
+      </w:pPr>
+      <w:r>
+        <w:rPr>
+          <w:rFonts w:ascii="Microsoft JhengHei" w:hAnsi="Microsoft JhengHei" w:eastAsia="Microsoft JhengHei"/>
+          <w:b/>
+          <w:color w:val="174F3B"/>
+          <w:sz w:val="23"/>
+        </w:rPr>
+        <w:t>閱讀時，先抓住原故事給你的線索</w:t>
+      </w:r>
+    </w:p>
+    <w:p>
+      <w:pPr>
+        <w:spacing w:before="0" w:after="20" w:line="355" w:lineRule="auto"/>
+      </w:pPr>
+      <w:r>
+        <w:rPr>
+          <w:rFonts w:ascii="Microsoft JhengHei" w:hAnsi="Microsoft JhengHei" w:eastAsia="Microsoft JhengHei"/>
+          <w:b/>
+          <w:color w:val="202020"/>
+          <w:sz w:val="21"/>
+        </w:rPr>
+        <w:t>□ 狼用了哪些方法，讓小紅帽和外婆陷入危險？</w:t>
+      </w:r>
+    </w:p>
+    <w:p>
+      <w:pPr>
+        <w:spacing w:before="0" w:after="60" w:line="355" w:lineRule="auto"/>
+      </w:pPr>
+      <w:r>
+        <w:rPr>
+          <w:rFonts w:ascii="Microsoft JhengHei" w:hAnsi="Microsoft JhengHei" w:eastAsia="Microsoft JhengHei"/>
+          <w:b w:val="0"/>
+          <w:color w:val="202020"/>
+          <w:sz w:val="21"/>
+        </w:rPr>
+        <w:t>＿＿＿＿＿＿＿＿＿＿＿＿＿＿＿＿＿＿＿＿＿＿＿＿＿＿＿＿＿＿＿＿＿＿＿＿</w:t>
+      </w:r>
+    </w:p>
+    <w:p>
+      <w:pPr>
+        <w:spacing w:before="0" w:after="20" w:line="355" w:lineRule="auto"/>
+      </w:pPr>
+      <w:r>
+        <w:rPr>
+          <w:rFonts w:ascii="Microsoft JhengHei" w:hAnsi="Microsoft JhengHei" w:eastAsia="Microsoft JhengHei"/>
+          <w:b/>
+          <w:color w:val="202020"/>
+          <w:sz w:val="21"/>
+        </w:rPr>
+        <w:t>□ 讀完後，你覺得原故事沒有說明狼的哪個部分？</w:t>
+      </w:r>
+    </w:p>
+    <w:p>
+      <w:pPr>
+        <w:spacing w:before="0" w:after="60" w:line="355" w:lineRule="auto"/>
+      </w:pPr>
+      <w:r>
+        <w:rPr>
+          <w:rFonts w:ascii="Microsoft JhengHei" w:hAnsi="Microsoft JhengHei" w:eastAsia="Microsoft JhengHei"/>
+          <w:b w:val="0"/>
+          <w:color w:val="202020"/>
+          <w:sz w:val="21"/>
+        </w:rPr>
+        <w:t>＿＿＿＿＿＿＿＿＿＿＿＿＿＿＿＿＿＿＿＿＿＿＿＿＿＿＿＿＿＿＿＿＿＿＿＿</w:t>
+      </w:r>
+    </w:p>
+    <w:p>
+      <w:r>
+        <w:br w:type="page"/>
+      </w:r>
+    </w:p>
+    <w:p>
+      <w:pPr>
         <w:spacing w:before="0" w:after="60" w:line="372" w:lineRule="auto"/>
       </w:pPr>
       <w:r>
@@ -1900,7 +2386,7 @@
           <w:color w:val="A9782A"/>
           <w:sz w:val="21"/>
         </w:rPr>
-        <w:t>故事 三・閱讀後再選</w:t>
+        <w:t>故事 三B・換個角度</w:t>
       </w:r>
     </w:p>
     <w:p>

</xml_diff>